<commit_message>
Update quiz rationale: fix Q10 explanation
</commit_message>
<xml_diff>
--- a/quiz_with_rationale.docx
+++ b/quiz_with_rationale.docx
@@ -3674,15 +3674,7 @@
         <w:ind w:hanging="360"/>
       </w:pPr>
       <w:r>
-        <w:t xml:space="preserve">D. </w:t>
-      </w:r>
-      <w:proofErr w:type="spellStart"/>
-      <w:r>
-        <w:t>Color</w:t>
-      </w:r>
-      <w:proofErr w:type="spellEnd"/>
-      <w:r>
-        <w:t xml:space="preserve"> correction  </w:t>
+        <w:t xml:space="preserve">D. Color correction  </w:t>
       </w:r>
     </w:p>
     <w:p>
@@ -3758,15 +3750,7 @@
         <w:ind w:hanging="360"/>
       </w:pPr>
       <w:r>
-        <w:t xml:space="preserve">D. </w:t>
-      </w:r>
-      <w:proofErr w:type="spellStart"/>
-      <w:r>
-        <w:t>Color</w:t>
-      </w:r>
-      <w:proofErr w:type="spellEnd"/>
-      <w:r>
-        <w:t xml:space="preserve"> correction </w:t>
+        <w:t xml:space="preserve">D. Color correction </w:t>
       </w:r>
     </w:p>
     <w:p>
@@ -3775,15 +3759,7 @@
         <w:ind w:left="731"/>
       </w:pPr>
       <w:r>
-        <w:t xml:space="preserve">Sobel works on gradients, not </w:t>
-      </w:r>
-      <w:proofErr w:type="spellStart"/>
-      <w:r>
-        <w:t>color</w:t>
-      </w:r>
-      <w:proofErr w:type="spellEnd"/>
-      <w:r>
-        <w:t xml:space="preserve"> balancing.  </w:t>
+        <w:t xml:space="preserve">Sobel works on gradients, not color balancing.  </w:t>
       </w:r>
     </w:p>
     <w:p>
@@ -5096,21 +5072,7 @@
         <w:rPr>
           <w:b/>
         </w:rPr>
-        <w:t xml:space="preserve">Q7. </w:t>
-      </w:r>
-      <w:proofErr w:type="spellStart"/>
-      <w:r>
-        <w:rPr>
-          <w:b/>
-        </w:rPr>
-        <w:t>Depthwise</w:t>
-      </w:r>
-      <w:proofErr w:type="spellEnd"/>
-      <w:r>
-        <w:rPr>
-          <w:b/>
-        </w:rPr>
-        <w:t xml:space="preserve"> convolution applies: </w:t>
+        <w:t xml:space="preserve">Q7. Depthwise convolution applies: </w:t>
       </w:r>
     </w:p>
     <w:p>
@@ -5192,14 +5154,21 @@
       <w:pPr>
         <w:spacing w:line="405" w:lineRule="auto"/>
         <w:ind w:right="984"/>
-      </w:pPr>
-      <w:proofErr w:type="spellStart"/>
-      <w:r>
-        <w:t>Depthwise</w:t>
-      </w:r>
-      <w:proofErr w:type="spellEnd"/>
-      <w:r>
-        <w:t xml:space="preserve"> convolution processes each channel independently with its own filter. Why the Other Options Are Tempting </w:t>
+        <w:rPr>
+          <w:lang w:val="en-GB"/>
+        </w:rPr>
+      </w:pPr>
+      <w:r>
+        <w:t xml:space="preserve">Depthwise convolution processes each channel independently with its own filter. </w:t>
+      </w:r>
+    </w:p>
+    <w:p>
+      <w:pPr>
+        <w:spacing w:line="405" w:lineRule="auto"/>
+        <w:ind w:right="984"/>
+      </w:pPr>
+      <w:r>
+        <w:t xml:space="preserve">Why the Other Options Are Tempting </w:t>
       </w:r>
     </w:p>
     <w:p>
@@ -6589,15 +6558,7 @@
         <w:ind w:hanging="360"/>
       </w:pPr>
       <w:r>
-        <w:t xml:space="preserve">A. </w:t>
-      </w:r>
-      <w:proofErr w:type="spellStart"/>
-      <w:r>
-        <w:t>Color</w:t>
-      </w:r>
-      <w:proofErr w:type="spellEnd"/>
-      <w:r>
-        <w:t xml:space="preserve">  </w:t>
+        <w:t xml:space="preserve">A. Color  </w:t>
       </w:r>
     </w:p>
     <w:p>
@@ -6680,15 +6641,7 @@
         <w:ind w:hanging="360"/>
       </w:pPr>
       <w:r>
-        <w:t xml:space="preserve">A. </w:t>
-      </w:r>
-      <w:proofErr w:type="spellStart"/>
-      <w:r>
-        <w:t>Color</w:t>
-      </w:r>
-      <w:proofErr w:type="spellEnd"/>
-      <w:r>
-        <w:t xml:space="preserve"> </w:t>
+        <w:t xml:space="preserve">A. Color </w:t>
       </w:r>
     </w:p>
     <w:p>
@@ -6697,15 +6650,7 @@
         <w:ind w:left="731"/>
       </w:pPr>
       <w:r>
-        <w:t xml:space="preserve">Laplacian works on intensity changes, not </w:t>
-      </w:r>
-      <w:proofErr w:type="spellStart"/>
-      <w:r>
-        <w:t>color</w:t>
-      </w:r>
-      <w:proofErr w:type="spellEnd"/>
-      <w:r>
-        <w:t xml:space="preserve">.  </w:t>
+        <w:t xml:space="preserve">Laplacian works on intensity changes, not color.  </w:t>
       </w:r>
     </w:p>
     <w:p>
@@ -7400,6 +7345,10 @@
         <w:spacing w:after="176" w:line="259" w:lineRule="auto"/>
         <w:ind w:left="-5"/>
         <w:jc w:val="left"/>
+        <w:rPr>
+          <w:b/>
+          <w:lang w:val="en-GB"/>
+        </w:rPr>
       </w:pPr>
       <w:r>
         <w:rPr>
@@ -7410,11 +7359,32 @@
     </w:p>
     <w:p>
       <w:pPr>
-        <w:spacing w:line="405" w:lineRule="auto"/>
-        <w:ind w:right="1813"/>
-      </w:pPr>
-      <w:r>
-        <w:t xml:space="preserve">Larger kernels require significantly more multiplications and parameters. Why the Other Options Are Tempting </w:t>
+        <w:spacing w:after="176" w:line="259" w:lineRule="auto"/>
+        <w:ind w:left="-5"/>
+        <w:jc w:val="left"/>
+        <w:rPr>
+          <w:bCs/>
+          <w:lang w:val="en-GB"/>
+        </w:rPr>
+      </w:pPr>
+      <w:r>
+        <w:rPr>
+          <w:bCs/>
+        </w:rPr>
+        <w:t>The number of multiplications per convolution position scales with K².</w:t>
+      </w:r>
+      <w:r>
+        <w:rPr>
+          <w:bCs/>
+          <w:lang w:val="en-GB"/>
+        </w:rPr>
+        <w:t xml:space="preserve"> </w:t>
+      </w:r>
+      <w:r>
+        <w:rPr>
+          <w:bCs/>
+        </w:rPr>
+        <w:t>Assuming fixed channel depth, kernel size has the greatest direct impact on computation per position compared to padding, stride, or activation functions.</w:t>
       </w:r>
     </w:p>
     <w:p>
@@ -7435,7 +7405,16 @@
         <w:ind w:left="731"/>
       </w:pPr>
       <w:r>
-        <w:t xml:space="preserve">Padding changes dimensions slightly but has smaller impact.  </w:t>
+        <w:rPr>
+          <w:lang w:val="en-GB"/>
+        </w:rPr>
+        <w:t>P</w:t>
+      </w:r>
+      <w:r>
+        <w:t>adding slightly increases the input size and therefore total operations, but the effect is small compared to kernel size growth.</w:t>
+      </w:r>
+      <w:r>
+        <w:t xml:space="preserve"> </w:t>
       </w:r>
     </w:p>
     <w:p>
@@ -7456,7 +7435,36 @@
         <w:ind w:left="731"/>
       </w:pPr>
       <w:r>
-        <w:t xml:space="preserve">Larger stride usually reduces computation.  </w:t>
+        <w:rPr>
+          <w:lang w:val="en-GB"/>
+        </w:rPr>
+        <w:t>L</w:t>
+      </w:r>
+      <w:r>
+        <w:t xml:space="preserve">arger stride </w:t>
+      </w:r>
+      <w:proofErr w:type="gramStart"/>
+      <w:r>
+        <w:rPr>
+          <w:lang w:val="en-GB"/>
+        </w:rPr>
+        <w:t xml:space="preserve">actually </w:t>
+      </w:r>
+      <w:r>
+        <w:t>reduces</w:t>
+      </w:r>
+      <w:proofErr w:type="gramEnd"/>
+      <w:r>
+        <w:t xml:space="preserve"> computation by skipping positions</w:t>
+      </w:r>
+      <w:r>
+        <w:rPr>
+          <w:lang w:val="en-GB"/>
+        </w:rPr>
+        <w:t>.</w:t>
+      </w:r>
+      <w:r>
+        <w:t xml:space="preserve"> </w:t>
       </w:r>
     </w:p>
     <w:p>
@@ -7475,19 +7483,27 @@
       <w:pPr>
         <w:spacing w:after="171"/>
         <w:ind w:left="731"/>
-      </w:pPr>
-      <w:r>
-        <w:t xml:space="preserve">Activations add computation but far less than large kernels. </w:t>
-      </w:r>
-    </w:p>
-    <w:p>
-      <w:pPr>
-        <w:spacing w:after="0" w:line="259" w:lineRule="auto"/>
-        <w:ind w:left="0" w:firstLine="0"/>
-        <w:jc w:val="left"/>
-      </w:pPr>
-      <w:r>
-        <w:t xml:space="preserve"> </w:t>
+        <w:rPr>
+          <w:lang w:val="en-GB"/>
+        </w:rPr>
+      </w:pPr>
+      <w:r>
+        <w:rPr>
+          <w:lang w:val="en-GB"/>
+        </w:rPr>
+        <w:t>A</w:t>
+      </w:r>
+      <w:r>
+        <w:t>ctivation functions add computation but are applied elementwise after convolution and contribute far less than a large kerne</w:t>
+      </w:r>
+      <w:r>
+        <w:rPr>
+          <w:lang w:val="en-GB"/>
+        </w:rPr>
+        <w:t>l</w:t>
+      </w:r>
+      <w:r>
+        <w:t xml:space="preserve">. </w:t>
       </w:r>
     </w:p>
     <w:sectPr>
@@ -8158,7 +8174,7 @@
         <w:kern w:val="2"/>
         <w:sz w:val="24"/>
         <w:szCs w:val="24"/>
-        <w:lang w:val="en-MT" w:eastAsia="en-MT" w:bidi="ar-SA"/>
+        <w:lang w:bidi="ar-SA"/>
         <w14:ligatures w14:val="standardContextual"/>
       </w:rPr>
     </w:rPrDefault>
@@ -8563,7 +8579,6 @@
   <w:style w:type="character" w:default="1" w:styleId="DefaultParagraphFont">
     <w:name w:val="Default Paragraph Font"/>
     <w:uiPriority w:val="1"/>
-    <w:semiHidden/>
     <w:unhideWhenUsed/>
   </w:style>
   <w:style w:type="table" w:default="1" w:styleId="TableNormal">

</xml_diff>